<commit_message>
Update Chapter 17 - Minister
</commit_message>
<xml_diff>
--- a/Chapter 17 - Minister.docx
+++ b/Chapter 17 - Minister.docx
@@ -39,7 +39,15 @@
         <w:t>e is</w:t>
       </w:r>
       <w:r>
-        <w:t xml:space="preserve"> a lovely man!” Mrs Ting was clearly dressed to go out shopping </w:t>
+        <w:t xml:space="preserve"> a lovely man!” </w:t>
+      </w:r>
+      <w:proofErr w:type="spellStart"/>
+      <w:r>
+        <w:t>Mrs</w:t>
+      </w:r>
+      <w:proofErr w:type="spellEnd"/>
+      <w:r>
+        <w:t xml:space="preserve"> Ting was clearly dressed to go out shopping </w:t>
       </w:r>
     </w:p>
     <w:p>
@@ -52,7 +60,15 @@
         <w:t>“He didn’t like anybody! Miserable sod!”</w:t>
       </w:r>
       <w:r>
-        <w:t xml:space="preserve"> Mrs Ting was collecting shopping bags from a cupboard and walking out of the door.</w:t>
+        <w:t xml:space="preserve"> </w:t>
+      </w:r>
+      <w:proofErr w:type="spellStart"/>
+      <w:r>
+        <w:t>Mrs</w:t>
+      </w:r>
+      <w:proofErr w:type="spellEnd"/>
+      <w:r>
+        <w:t xml:space="preserve"> Ting was collecting shopping bags from a cupboard and walking out of the door.</w:t>
       </w:r>
     </w:p>
     <w:p>
@@ -87,7 +103,15 @@
         <w:t xml:space="preserve">going to come down. </w:t>
       </w:r>
       <w:r>
-        <w:t>Gordon was worried it would come down when everyone was singing. They used to make a lot of noise you know, those Unitarians!</w:t>
+        <w:t xml:space="preserve">Gordon was worried it would come down when everyone was singing. They used to make a lot of </w:t>
+      </w:r>
+      <w:proofErr w:type="gramStart"/>
+      <w:r>
+        <w:t>noise</w:t>
+      </w:r>
+      <w:proofErr w:type="gramEnd"/>
+      <w:r>
+        <w:t xml:space="preserve"> you know, those Unitarians!</w:t>
       </w:r>
       <w:r>
         <w:t xml:space="preserve"> Gordon was worried they’d all be singing ‘Sing Hosannah’ and the roof would fall in.</w:t>
@@ -96,7 +120,31 @@
         <w:t xml:space="preserve"> It was going to cost a fortune to redo the roof.</w:t>
       </w:r>
       <w:r>
-        <w:t xml:space="preserve"> And that roof, it isn’t just plain is it? It’s got all them paintings on it.</w:t>
+        <w:t xml:space="preserve"> And that roof, it isn’t just </w:t>
+      </w:r>
+      <w:proofErr w:type="gramStart"/>
+      <w:r>
+        <w:t>plain</w:t>
+      </w:r>
+      <w:proofErr w:type="gramEnd"/>
+      <w:r>
+        <w:t xml:space="preserve"> is it? It’s got </w:t>
+      </w:r>
+      <w:proofErr w:type="gramStart"/>
+      <w:r>
+        <w:t>all</w:t>
+      </w:r>
+      <w:proofErr w:type="gramEnd"/>
+      <w:r>
+        <w:t xml:space="preserve"> </w:t>
+      </w:r>
+      <w:proofErr w:type="gramStart"/>
+      <w:r>
+        <w:t>them</w:t>
+      </w:r>
+      <w:proofErr w:type="gramEnd"/>
+      <w:r>
+        <w:t xml:space="preserve"> paintings on it.</w:t>
       </w:r>
       <w:r>
         <w:t xml:space="preserve"> And so, if you were going to take them off? That was a fortune!”</w:t>
@@ -115,7 +163,15 @@
         <w:t>rrog</w:t>
       </w:r>
       <w:r>
-        <w:t>ation session with Mrs Ting?</w:t>
+        <w:t xml:space="preserve">ation session with </w:t>
+      </w:r>
+      <w:proofErr w:type="spellStart"/>
+      <w:r>
+        <w:t>Mrs</w:t>
+      </w:r>
+      <w:proofErr w:type="spellEnd"/>
+      <w:r>
+        <w:t xml:space="preserve"> Ting?</w:t>
       </w:r>
     </w:p>
     <w:p>
@@ -126,11 +182,16 @@
         <w:t>,</w:t>
       </w:r>
       <w:r>
-        <w:t xml:space="preserve"> they auctioned it! That was a big day! I did the tea</w:t>
+        <w:t xml:space="preserve"> they auctioned it! That was a big day! I did the </w:t>
+      </w:r>
+      <w:proofErr w:type="gramStart"/>
+      <w:r>
+        <w:t>tea</w:t>
       </w:r>
       <w:r>
         <w:t>,</w:t>
       </w:r>
+      <w:proofErr w:type="gramEnd"/>
       <w:r>
         <w:t xml:space="preserve"> and biscuits in the back hall.</w:t>
       </w:r>
@@ -151,7 +212,23 @@
     </w:p>
     <w:p>
       <w:r>
-        <w:t>“And did Mr Boht buy it?”</w:t>
+        <w:t xml:space="preserve">“And did </w:t>
+      </w:r>
+      <w:proofErr w:type="spellStart"/>
+      <w:r>
+        <w:t>Mr</w:t>
+      </w:r>
+      <w:proofErr w:type="spellEnd"/>
+      <w:r>
+        <w:t xml:space="preserve"> </w:t>
+      </w:r>
+      <w:proofErr w:type="spellStart"/>
+      <w:r>
+        <w:t>Boht</w:t>
+      </w:r>
+      <w:proofErr w:type="spellEnd"/>
+      <w:r>
+        <w:t xml:space="preserve"> buy it?”</w:t>
       </w:r>
     </w:p>
     <w:p>
@@ -213,18 +290,47 @@
       </w:r>
     </w:p>
     <w:p>
-      <w:r>
-        <w:t>Mrs Ting had reached out and opened a drawer on the Welsh dresser in the kitchen and was reading from her notebook.</w:t>
-      </w:r>
-    </w:p>
-    <w:p>
-      <w:r>
-        <w:t>“See he was my employer, well, for six months. Anyway, until Mr Boht came along, so I wrote it down, I wrote his name down.”</w:t>
-      </w:r>
-    </w:p>
-    <w:p>
-      <w:r>
-        <w:t>He looked at the card that she offered him, that she’d taken out of her notebook.</w:t>
+      <w:proofErr w:type="spellStart"/>
+      <w:r>
+        <w:t>Mrs</w:t>
+      </w:r>
+      <w:proofErr w:type="spellEnd"/>
+      <w:r>
+        <w:t xml:space="preserve"> Ting had reached out and opened a drawer on the Welsh dresser in the kitchen and was reading from her notebook.</w:t>
+      </w:r>
+    </w:p>
+    <w:p>
+      <w:r>
+        <w:t xml:space="preserve">“See he was my employer, well, for six months. Anyway, until </w:t>
+      </w:r>
+      <w:proofErr w:type="spellStart"/>
+      <w:r>
+        <w:t>Mr</w:t>
+      </w:r>
+      <w:proofErr w:type="spellEnd"/>
+      <w:r>
+        <w:t xml:space="preserve"> </w:t>
+      </w:r>
+      <w:proofErr w:type="spellStart"/>
+      <w:r>
+        <w:t>Boht</w:t>
+      </w:r>
+      <w:proofErr w:type="spellEnd"/>
+      <w:r>
+        <w:t xml:space="preserve"> came along, so I wrote it down, I wrote his name down.”</w:t>
+      </w:r>
+    </w:p>
+    <w:p>
+      <w:r>
+        <w:t xml:space="preserve">He looked at the card that she </w:t>
+      </w:r>
+      <w:proofErr w:type="gramStart"/>
+      <w:r>
+        <w:t>offered</w:t>
+      </w:r>
+      <w:proofErr w:type="gramEnd"/>
+      <w:r>
+        <w:t xml:space="preserve"> him, that she’d taken out of her notebook.</w:t>
       </w:r>
     </w:p>
     <w:p>
@@ -239,8 +345,26 @@
       </w:r>
     </w:p>
     <w:p>
-      <w:r>
-        <w:t>Jewellery, books and antiques, gold a speciality.</w:t>
+      <w:proofErr w:type="spellStart"/>
+      <w:r>
+        <w:t>Jewellery</w:t>
+      </w:r>
+      <w:proofErr w:type="spellEnd"/>
+      <w:r>
+        <w:t xml:space="preserve">, books and antiques, gold </w:t>
+      </w:r>
+      <w:proofErr w:type="gramStart"/>
+      <w:r>
+        <w:t xml:space="preserve">a </w:t>
+      </w:r>
+      <w:proofErr w:type="spellStart"/>
+      <w:r>
+        <w:t>speciality</w:t>
+      </w:r>
+      <w:proofErr w:type="spellEnd"/>
+      <w:proofErr w:type="gramEnd"/>
+      <w:r>
+        <w:t>.</w:t>
       </w:r>
     </w:p>
     <w:p>
@@ -250,12 +374,28 @@
     </w:p>
     <w:p>
       <w:r>
-        <w:t>Was this Mr D’Aubeilles?</w:t>
-      </w:r>
-    </w:p>
-    <w:p>
-      <w:r>
-        <w:t>He held up his phone to Mrs Ting.</w:t>
+        <w:t xml:space="preserve">Was this </w:t>
+      </w:r>
+      <w:proofErr w:type="spellStart"/>
+      <w:r>
+        <w:t>Mr</w:t>
+      </w:r>
+      <w:proofErr w:type="spellEnd"/>
+      <w:r>
+        <w:t xml:space="preserve"> D’Aubeilles?</w:t>
+      </w:r>
+    </w:p>
+    <w:p>
+      <w:r>
+        <w:t xml:space="preserve">He held up his phone to </w:t>
+      </w:r>
+      <w:proofErr w:type="spellStart"/>
+      <w:r>
+        <w:t>Mrs</w:t>
+      </w:r>
+      <w:proofErr w:type="spellEnd"/>
+      <w:r>
+        <w:t xml:space="preserve"> Ting.</w:t>
       </w:r>
     </w:p>
     <w:p>
@@ -265,7 +405,15 @@
     </w:p>
     <w:p>
       <w:r>
-        <w:t>“No, Mrs Ting, I’m not related to him.”</w:t>
+        <w:t xml:space="preserve">“No, </w:t>
+      </w:r>
+      <w:proofErr w:type="spellStart"/>
+      <w:r>
+        <w:t>Mrs</w:t>
+      </w:r>
+      <w:proofErr w:type="spellEnd"/>
+      <w:r>
+        <w:t xml:space="preserve"> Ting, I’m not related to him.”</w:t>
       </w:r>
     </w:p>
     <w:p>
@@ -285,7 +433,15 @@
     </w:p>
     <w:p>
       <w:r>
-        <w:t>“Ooh is he? What for?”</w:t>
+        <w:t>“</w:t>
+      </w:r>
+      <w:proofErr w:type="gramStart"/>
+      <w:r>
+        <w:t>Ooh</w:t>
+      </w:r>
+      <w:proofErr w:type="gramEnd"/>
+      <w:r>
+        <w:t xml:space="preserve"> is he? What for?”</w:t>
       </w:r>
     </w:p>
     <w:p>
@@ -294,7 +450,31 @@
       </w:r>
       <w:r>
         <w:br/>
-        <w:t>“That’s odd innit? Wonder why he sold everything to Mr Boht then?”</w:t>
+        <w:t xml:space="preserve">“That’s odd </w:t>
+      </w:r>
+      <w:proofErr w:type="spellStart"/>
+      <w:r>
+        <w:t>innit</w:t>
+      </w:r>
+      <w:proofErr w:type="spellEnd"/>
+      <w:r>
+        <w:t xml:space="preserve">? Wonder why he sold everything to </w:t>
+      </w:r>
+      <w:proofErr w:type="spellStart"/>
+      <w:r>
+        <w:t>Mr</w:t>
+      </w:r>
+      <w:proofErr w:type="spellEnd"/>
+      <w:r>
+        <w:t xml:space="preserve"> </w:t>
+      </w:r>
+      <w:proofErr w:type="spellStart"/>
+      <w:r>
+        <w:t>Boht</w:t>
+      </w:r>
+      <w:proofErr w:type="spellEnd"/>
+      <w:r>
+        <w:t xml:space="preserve"> then?”</w:t>
       </w:r>
     </w:p>
     <w:p>
@@ -325,7 +505,133 @@
         <w:rPr>
           <w:iCs/>
         </w:rPr>
-        <w:t>I comes in to clean and there’s Mr Boht. And he says ‘Oh, you must be Mrs Ting.’ And I says, yes, I am, and who might you be? And he says ‘Mr Boht.’</w:t>
+        <w:t xml:space="preserve">I </w:t>
+      </w:r>
+      <w:proofErr w:type="gramStart"/>
+      <w:r>
+        <w:rPr>
+          <w:iCs/>
+        </w:rPr>
+        <w:t>comes</w:t>
+      </w:r>
+      <w:proofErr w:type="gramEnd"/>
+      <w:r>
+        <w:rPr>
+          <w:iCs/>
+        </w:rPr>
+        <w:t xml:space="preserve"> </w:t>
+      </w:r>
+      <w:proofErr w:type="gramStart"/>
+      <w:r>
+        <w:rPr>
+          <w:iCs/>
+        </w:rPr>
+        <w:t>in to</w:t>
+      </w:r>
+      <w:proofErr w:type="gramEnd"/>
+      <w:r>
+        <w:rPr>
+          <w:iCs/>
+        </w:rPr>
+        <w:t xml:space="preserve"> clean and there’s </w:t>
+      </w:r>
+      <w:proofErr w:type="spellStart"/>
+      <w:r>
+        <w:rPr>
+          <w:iCs/>
+        </w:rPr>
+        <w:t>Mr</w:t>
+      </w:r>
+      <w:proofErr w:type="spellEnd"/>
+      <w:r>
+        <w:rPr>
+          <w:iCs/>
+        </w:rPr>
+        <w:t xml:space="preserve"> </w:t>
+      </w:r>
+      <w:proofErr w:type="spellStart"/>
+      <w:r>
+        <w:rPr>
+          <w:iCs/>
+        </w:rPr>
+        <w:t>Boht</w:t>
+      </w:r>
+      <w:proofErr w:type="spellEnd"/>
+      <w:r>
+        <w:rPr>
+          <w:iCs/>
+        </w:rPr>
+        <w:t xml:space="preserve">. And he </w:t>
+      </w:r>
+      <w:proofErr w:type="gramStart"/>
+      <w:r>
+        <w:rPr>
+          <w:iCs/>
+        </w:rPr>
+        <w:t>says ‘</w:t>
+      </w:r>
+      <w:proofErr w:type="gramEnd"/>
+      <w:r>
+        <w:rPr>
+          <w:iCs/>
+        </w:rPr>
+        <w:t xml:space="preserve">Oh, you must be </w:t>
+      </w:r>
+      <w:proofErr w:type="spellStart"/>
+      <w:r>
+        <w:rPr>
+          <w:iCs/>
+        </w:rPr>
+        <w:t>Mrs</w:t>
+      </w:r>
+      <w:proofErr w:type="spellEnd"/>
+      <w:r>
+        <w:rPr>
+          <w:iCs/>
+        </w:rPr>
+        <w:t xml:space="preserve"> Ting.’ And I </w:t>
+      </w:r>
+      <w:proofErr w:type="gramStart"/>
+      <w:r>
+        <w:rPr>
+          <w:iCs/>
+        </w:rPr>
+        <w:t>says</w:t>
+      </w:r>
+      <w:proofErr w:type="gramEnd"/>
+      <w:r>
+        <w:rPr>
+          <w:iCs/>
+        </w:rPr>
+        <w:t>, yes, I am, and who might you be? And he says ‘</w:t>
+      </w:r>
+      <w:proofErr w:type="spellStart"/>
+      <w:r>
+        <w:rPr>
+          <w:iCs/>
+        </w:rPr>
+        <w:t>Mr</w:t>
+      </w:r>
+      <w:proofErr w:type="spellEnd"/>
+      <w:r>
+        <w:rPr>
+          <w:iCs/>
+        </w:rPr>
+        <w:t xml:space="preserve"> </w:t>
+      </w:r>
+      <w:proofErr w:type="spellStart"/>
+      <w:r>
+        <w:rPr>
+          <w:iCs/>
+        </w:rPr>
+        <w:t>Boht</w:t>
+      </w:r>
+      <w:proofErr w:type="spellEnd"/>
+      <w:r>
+        <w:rPr>
+          <w:iCs/>
+        </w:rPr>
+        <w:t>.’</w:t>
       </w:r>
       <w:r>
         <w:rPr>
@@ -338,7 +644,63 @@
           <w:iCs/>
         </w:rPr>
         <w:lastRenderedPageBreak/>
-        <w:t>he tells me he’s bought the place from Mr D’Aubeilles. And I say ‘what you’ve bought all them antiques and that furniture?’ And he says ‘yes,’ he says he had to go abroad in a hurry and so it was a quick sale.”</w:t>
+        <w:t xml:space="preserve">he tells me he’s bought the place from </w:t>
+      </w:r>
+      <w:proofErr w:type="spellStart"/>
+      <w:r>
+        <w:rPr>
+          <w:iCs/>
+        </w:rPr>
+        <w:t>Mr</w:t>
+      </w:r>
+      <w:proofErr w:type="spellEnd"/>
+      <w:r>
+        <w:rPr>
+          <w:iCs/>
+        </w:rPr>
+        <w:t xml:space="preserve"> D’Aubeilles. And I </w:t>
+      </w:r>
+      <w:proofErr w:type="gramStart"/>
+      <w:r>
+        <w:rPr>
+          <w:iCs/>
+        </w:rPr>
+        <w:t>say</w:t>
+      </w:r>
+      <w:proofErr w:type="gramEnd"/>
+      <w:r>
+        <w:rPr>
+          <w:iCs/>
+        </w:rPr>
+        <w:t xml:space="preserve"> ‘what you’ve bought </w:t>
+      </w:r>
+      <w:proofErr w:type="gramStart"/>
+      <w:r>
+        <w:rPr>
+          <w:iCs/>
+        </w:rPr>
+        <w:t>all</w:t>
+      </w:r>
+      <w:proofErr w:type="gramEnd"/>
+      <w:r>
+        <w:rPr>
+          <w:iCs/>
+        </w:rPr>
+        <w:t xml:space="preserve"> </w:t>
+      </w:r>
+      <w:proofErr w:type="gramStart"/>
+      <w:r>
+        <w:rPr>
+          <w:iCs/>
+        </w:rPr>
+        <w:t>them</w:t>
+      </w:r>
+      <w:proofErr w:type="gramEnd"/>
+      <w:r>
+        <w:rPr>
+          <w:iCs/>
+        </w:rPr>
+        <w:t xml:space="preserve"> antiques and that furniture?’ And he says ‘yes,’ he says he had to go abroad in a hurry and so it was a quick sale.”</w:t>
       </w:r>
     </w:p>
     <w:p>
@@ -351,7 +713,21 @@
         <w:rPr>
           <w:iCs/>
         </w:rPr>
-        <w:t>“So he left everything?”</w:t>
+        <w:t>“</w:t>
+      </w:r>
+      <w:proofErr w:type="gramStart"/>
+      <w:r>
+        <w:rPr>
+          <w:iCs/>
+        </w:rPr>
+        <w:t>So</w:t>
+      </w:r>
+      <w:proofErr w:type="gramEnd"/>
+      <w:r>
+        <w:rPr>
+          <w:iCs/>
+        </w:rPr>
+        <w:t xml:space="preserve"> he left everything?”</w:t>
       </w:r>
     </w:p>
     <w:p>
@@ -383,7 +759,49 @@
         <w:rPr>
           <w:iCs/>
         </w:rPr>
-        <w:t>And then Mr Boht, he said I should just carry on cleaning for him as I did for Mr D’Aubeilles, but…”</w:t>
+        <w:t xml:space="preserve">And then </w:t>
+      </w:r>
+      <w:proofErr w:type="spellStart"/>
+      <w:r>
+        <w:rPr>
+          <w:iCs/>
+        </w:rPr>
+        <w:t>Mr</w:t>
+      </w:r>
+      <w:proofErr w:type="spellEnd"/>
+      <w:r>
+        <w:rPr>
+          <w:iCs/>
+        </w:rPr>
+        <w:t xml:space="preserve"> </w:t>
+      </w:r>
+      <w:proofErr w:type="spellStart"/>
+      <w:r>
+        <w:rPr>
+          <w:iCs/>
+        </w:rPr>
+        <w:t>Boht</w:t>
+      </w:r>
+      <w:proofErr w:type="spellEnd"/>
+      <w:r>
+        <w:rPr>
+          <w:iCs/>
+        </w:rPr>
+        <w:t xml:space="preserve">, he said I should just carry on cleaning for him as I did for </w:t>
+      </w:r>
+      <w:proofErr w:type="spellStart"/>
+      <w:r>
+        <w:rPr>
+          <w:iCs/>
+        </w:rPr>
+        <w:t>Mr</w:t>
+      </w:r>
+      <w:proofErr w:type="spellEnd"/>
+      <w:r>
+        <w:rPr>
+          <w:iCs/>
+        </w:rPr>
+        <w:t xml:space="preserve"> D’Aubeilles, but…”</w:t>
       </w:r>
     </w:p>
     <w:p>
@@ -416,7 +834,49 @@
           <w:iCs/>
         </w:rPr>
         <w:br/>
-        <w:t>“Ooh, yes there is! I haven’t been down there in years, well, since Mr Boht came actually.”</w:t>
+        <w:t xml:space="preserve">“Ooh, yes there is! I haven’t been down there in years, well, since </w:t>
+      </w:r>
+      <w:proofErr w:type="spellStart"/>
+      <w:r>
+        <w:rPr>
+          <w:iCs/>
+        </w:rPr>
+        <w:t>Mr</w:t>
+      </w:r>
+      <w:proofErr w:type="spellEnd"/>
+      <w:r>
+        <w:rPr>
+          <w:iCs/>
+        </w:rPr>
+        <w:t xml:space="preserve"> </w:t>
+      </w:r>
+      <w:proofErr w:type="spellStart"/>
+      <w:r>
+        <w:rPr>
+          <w:iCs/>
+        </w:rPr>
+        <w:t>Boht</w:t>
+      </w:r>
+      <w:proofErr w:type="spellEnd"/>
+      <w:r>
+        <w:rPr>
+          <w:iCs/>
+        </w:rPr>
+        <w:t xml:space="preserve"> </w:t>
+      </w:r>
+      <w:proofErr w:type="gramStart"/>
+      <w:r>
+        <w:rPr>
+          <w:iCs/>
+        </w:rPr>
+        <w:t>came actually</w:t>
+      </w:r>
+      <w:proofErr w:type="gramEnd"/>
+      <w:r>
+        <w:rPr>
+          <w:iCs/>
+        </w:rPr>
+        <w:t>.”</w:t>
       </w:r>
     </w:p>
     <w:p>
@@ -494,7 +954,21 @@
         <w:rPr>
           <w:iCs/>
         </w:rPr>
-        <w:t xml:space="preserve"> But that’s not all! In the back is a maze! It’s a maze of books! And some of those books are worth hundreds out thousands and auction!</w:t>
+        <w:t xml:space="preserve"> But that’s not all! In the back is a maze! It’s a maze of books! And some of those books are worth hundreds </w:t>
+      </w:r>
+      <w:proofErr w:type="gramStart"/>
+      <w:r>
+        <w:rPr>
+          <w:iCs/>
+        </w:rPr>
+        <w:t>out</w:t>
+      </w:r>
+      <w:proofErr w:type="gramEnd"/>
+      <w:r>
+        <w:rPr>
+          <w:iCs/>
+        </w:rPr>
+        <w:t xml:space="preserve"> thousands and auction!</w:t>
       </w:r>
       <w:r>
         <w:rPr>
@@ -513,7 +987,33 @@
         <w:rPr>
           <w:iCs/>
         </w:rPr>
-        <w:t>What he really wanted to do was to let Mrs Ting go shopping and spend the afternoon chatting to Lilly, But what he knew he was going to have to do was find out what was in the cellar.</w:t>
+        <w:t xml:space="preserve">What he really wanted to do was to let </w:t>
+      </w:r>
+      <w:proofErr w:type="spellStart"/>
+      <w:r>
+        <w:rPr>
+          <w:iCs/>
+        </w:rPr>
+        <w:t>Mrs</w:t>
+      </w:r>
+      <w:proofErr w:type="spellEnd"/>
+      <w:r>
+        <w:rPr>
+          <w:iCs/>
+        </w:rPr>
+        <w:t xml:space="preserve"> Ting go shopping and spend the afternoon chatting to Lilly</w:t>
+      </w:r>
+      <w:r>
+        <w:rPr>
+          <w:iCs/>
+        </w:rPr>
+        <w:t>.</w:t>
+      </w:r>
+      <w:r>
+        <w:rPr>
+          <w:iCs/>
+        </w:rPr>
+        <w:t xml:space="preserve"> But what he knew he was going to have to do was find out what was in the cellar.</w:t>
       </w:r>
     </w:p>
     <w:p/>

</xml_diff>